<commit_message>
feat: video input + depth map preview + frontend redesign
- Video input: extract frames from video, smart selection (blur/redundancy/interval)
- Depth map preview: Turbo pseudo-color PNGs, lightbox viewer, keyboard navigation
- Frontend redesign: Precision Instrument dark theme (IBM Plex Sans + JetBrains Mono)
- Viewer3D: auto-rotate turntable animation
- Docs: academic paper, PPT content, project markdown, feature ideas tracker
- Config: video processing parameters
</commit_message>
<xml_diff>
--- a/基于COLMAP与深度学习MVS的混合式三维重建系统.docx
+++ b/基于COLMAP与深度学习MVS的混合式三维重建系统.docx
@@ -825,11 +825,7 @@
         <w:jc w:val="left"/>
       </w:pPr>
       <w:r>
-        <w:rPr>
-          <w:rFonts w:ascii="Arial" w:hAnsi="Arial" w:eastAsia="等线" w:cs="Arial"/>
-          <w:sz w:val="22"/>
-        </w:rPr>
-        <w:t>1.  模型选择与优化：选择MVSNet作为基础模型，结合CasMVSNet由粗到细的深度估计策略，优化网络结构，降低计算成本，提升深度估计的精度与实时性；利用TensorRT进行模型优化，进一步提升推理速度；</w:t>
+        <w:t>1.  模型选择与优化：以CasMVSNet作为核心模型，采用其三阶段由粗到细的级联深度估计策略，逐阶段细化深度图，在保证重建精度的同时有效降低计算成本；同时集成PatchMatchNet作为备选模型，提供迭代式PatchMatch深度估计方案，适应不同场景需求；两个模型均支持DTU和BlendedMVS数据集预训练权重加载，提升模型泛化能力。</w:t>
       </w:r>
     </w:p>
     <w:p>
@@ -853,11 +849,7 @@
         <w:jc w:val="left"/>
       </w:pPr>
       <w:r>
-        <w:rPr>
-          <w:rFonts w:ascii="Arial" w:hAnsi="Arial" w:eastAsia="等线" w:cs="Arial"/>
-          <w:sz w:val="22"/>
-        </w:rPr>
-        <w:t>3.  深度推理：利用PyTorch框架搭建模型推理环境，将预处理后的输入数据传入模型，生成每个像素的深度值，得到稠密深度图；</w:t>
+        <w:t>3.  深度推理：利用PyTorch框架搭建模型推理环境，将预处理后的输入数据传入CasMVSNet模型，通过级联多阶段深度估计生成高精度稠密深度图；支持GPU加速与CPU回退模式，自动检测CUDA可用性并选择最优运行设备。</w:t>
       </w:r>
     </w:p>
     <w:p>
@@ -895,85 +887,142 @@
         <w:jc w:val="left"/>
         <w:outlineLvl w:val="2"/>
       </w:pPr>
-      <w:bookmarkStart w:id="15" w:name="heading_15"/>
+      <w:r>
+        <w:t>3.2.3 自研深度融合与双路径稠密重建模块</w:t>
+      </w:r>
+    </w:p>
+    <w:p>
+      <w:pPr>
+        <w:spacing w:before="120" w:after="120" w:line="288" w:lineRule="auto"/>
+        <w:ind w:left="0"/>
+        <w:jc w:val="left"/>
+      </w:pPr>
+      <w:r>
+        <w:t>该模块负责将深度学习MVS模型生成的稠密深度图融合为高精度的稠密点云，同时提供COLMAP PatchMatch稠密重建作为备选路径，形成双路径混合重建方案。具体实现内容包括：</w:t>
+      </w:r>
+    </w:p>
+    <w:p>
+      <w:pPr>
+        <w:spacing w:before="120" w:after="120" w:line="288" w:lineRule="auto"/>
+        <w:ind w:left="0"/>
+        <w:jc w:val="left"/>
+      </w:pPr>
+      <w:r>
+        <w:t>1.  深度图融合引擎（DenseFusion）：独立实现多视角几何一致性融合算法，支持DTU风格的多视图一致性过滤——每个像素的深度值需在至少2个其他视图中通过重投影验证，有效滤除噪声和冲突深度，生成高质量稠密点云；支持体素降采样与异常值过滤，优化点云密度和质量。</w:t>
+      </w:r>
+    </w:p>
+    <w:p>
+      <w:pPr>
+        <w:spacing w:before="120" w:after="120" w:line="288" w:lineRule="auto"/>
+        <w:ind w:left="0"/>
+        <w:jc w:val="left"/>
+      </w:pPr>
+      <w:r>
+        <w:t>2.  COLMAP PatchMatch稠密重建路径：作为可靠备选方案，直接调用COLMAP的PatchMatch立体匹配与深度融合管道（image_undistorter → patch_match_stereo → stereo_fusion），生成稠密点云。该路径在真实场景下效果稳定，作为默认重建模式。</w:t>
+      </w:r>
+    </w:p>
+    <w:p>
+      <w:pPr>
+        <w:spacing w:before="120" w:after="120" w:line="288" w:lineRule="auto"/>
+        <w:ind w:left="0"/>
+        <w:jc w:val="left"/>
+      </w:pPr>
+      <w:r>
+        <w:t>3.  格式转换模块（FormatConverter）：负责COLMAP SfM输出与MVS网络输入之间的双向格式转换，包括相机外参W2C/C2W转换、内参缩放适配、图像规范化、深度范围自动估计等，确保数据在不同模块间流转时的一致性和准确性。</w:t>
+      </w:r>
+    </w:p>
+    <w:p>
+      <w:pPr>
+        <w:spacing w:before="120" w:after="120" w:line="288" w:lineRule="auto"/>
+        <w:ind w:left="0"/>
+        <w:jc w:val="left"/>
+      </w:pPr>
+      <w:r>
+        <w:t>该模块的核心创新在于双路径设计——用户可根据场景特点选择COLMAP PatchMatch路径（更稳定、适合一般场景）或深度学习MVS路径（在弱纹理区域更有优势），实现“传统几何+深度学习”的灵活互补。</w:t>
+      </w:r>
+    </w:p>
+    <w:p>
+      <w:pPr>
+        <w:spacing w:before="300" w:after="120" w:line="288" w:lineRule="auto"/>
+        <w:ind w:left="0"/>
+        <w:jc w:val="left"/>
+        <w:outlineLvl w:val="2"/>
+      </w:pPr>
+      <w:bookmarkStart w:id="16" w:name="heading_16"/>
       <w:r>
         <w:rPr>
           <w:rFonts w:ascii="Arial" w:hAnsi="Arial" w:eastAsia="等线" w:cs="Arial"/>
           <w:b/>
           <w:sz w:val="30"/>
         </w:rPr>
-        <w:t>3.2.3 COLMAP深度融合模块</w:t>
-      </w:r>
-      <w:bookmarkEnd w:id="15"/>
-    </w:p>
-    <w:p>
-      <w:pPr>
-        <w:spacing w:before="120" w:after="120" w:line="288" w:lineRule="auto"/>
-        <w:ind w:left="0"/>
-        <w:jc w:val="left"/>
-      </w:pPr>
-      <w:r>
-        <w:rPr>
-          <w:rFonts w:ascii="Arial" w:hAnsi="Arial" w:eastAsia="等线" w:cs="Arial"/>
-          <w:sz w:val="22"/>
-        </w:rPr>
-        <w:t>该模块负责将深度学习MVS模型生成的稠密深度图与COLMAP生成的稀疏点云进行融合，生成高精度的稠密点云，为后续三维模型构建提供基础。具体实现内容包括：</w:t>
-      </w:r>
-    </w:p>
-    <w:p>
-      <w:pPr>
-        <w:spacing w:before="120" w:after="120" w:line="288" w:lineRule="auto"/>
-        <w:ind w:left="0"/>
-        <w:jc w:val="left"/>
-      </w:pPr>
-      <w:r>
-        <w:rPr>
-          <w:rFonts w:ascii="Arial" w:hAnsi="Arial" w:eastAsia="等线" w:cs="Arial"/>
-          <w:sz w:val="22"/>
-        </w:rPr>
-        <w:t>1.  格式统一：将深度学习模型输出的深度图转换为COLMAP可接受的格式，确保深度图与相机位姿、稀疏点云的坐标系一致；</w:t>
-      </w:r>
-    </w:p>
-    <w:p>
-      <w:pPr>
-        <w:spacing w:before="120" w:after="120" w:line="288" w:lineRule="auto"/>
-        <w:ind w:left="0"/>
-        <w:jc w:val="left"/>
-      </w:pPr>
-      <w:r>
-        <w:rPr>
-          <w:rFonts w:ascii="Arial" w:hAnsi="Arial" w:eastAsia="等线" w:cs="Arial"/>
-          <w:sz w:val="22"/>
-        </w:rPr>
-        <w:t>2.  深度融合：利用COLMAP的稠密融合算法，将深度图与稀疏点云进行融合，通过三角测量与重投影误差优化，生成稠密点云；</w:t>
-      </w:r>
-    </w:p>
-    <w:p>
-      <w:pPr>
-        <w:spacing w:before="120" w:after="120" w:line="288" w:lineRule="auto"/>
-        <w:ind w:left="0"/>
-        <w:jc w:val="left"/>
-      </w:pPr>
-      <w:r>
-        <w:rPr>
-          <w:rFonts w:ascii="Arial" w:hAnsi="Arial" w:eastAsia="等线" w:cs="Arial"/>
-          <w:sz w:val="22"/>
-        </w:rPr>
-        <w:t>3.  稠密点云优化：对融合后的稠密点云进行去噪、滤波、简化等操作，去除冗余点与异常点，减少点云数据量，提升后续模型构建与可视化的效率。</w:t>
-      </w:r>
-    </w:p>
-    <w:p>
-      <w:pPr>
-        <w:spacing w:before="120" w:after="120" w:line="288" w:lineRule="auto"/>
-        <w:ind w:left="0"/>
-        <w:jc w:val="left"/>
-      </w:pPr>
-      <w:r>
-        <w:rPr>
-          <w:rFonts w:ascii="Arial" w:hAnsi="Arial" w:eastAsia="等线" w:cs="Arial"/>
-          <w:sz w:val="22"/>
-        </w:rPr>
-        <w:t>该模块的核心是解决深度学习深度图与传统几何数据的兼容性问题，实现“传统几何+深度学习”的优势互补，提升稠密点云的质量。</w:t>
+        <w:t>3.2.4 Flask后端API封装</w:t>
+      </w:r>
+      <w:bookmarkEnd w:id="16"/>
+    </w:p>
+    <w:p>
+      <w:pPr>
+        <w:spacing w:before="120" w:after="120" w:line="288" w:lineRule="auto"/>
+        <w:ind w:left="0"/>
+        <w:jc w:val="left"/>
+      </w:pPr>
+      <w:r>
+        <w:rPr>
+          <w:rFonts w:ascii="Arial" w:hAnsi="Arial" w:eastAsia="等线" w:cs="Arial"/>
+          <w:sz w:val="22"/>
+        </w:rPr>
+        <w:t>该模块负责将上述三个核心模块封装为API接口，实现前端与后端的交互，处理用户的请求，完成重建任务的调度与执行。具体实现内容包括：</w:t>
+      </w:r>
+    </w:p>
+    <w:p>
+      <w:pPr>
+        <w:spacing w:before="120" w:after="120" w:line="288" w:lineRule="auto"/>
+        <w:ind w:left="0"/>
+        <w:jc w:val="left"/>
+      </w:pPr>
+      <w:r>
+        <w:rPr>
+          <w:rFonts w:ascii="Arial" w:hAnsi="Arial" w:eastAsia="等线" w:cs="Arial"/>
+          <w:sz w:val="22"/>
+        </w:rPr>
+        <w:t>1.  API接口设计：设计图像上传、重建任务提交、进度查询、模型下载、任务取消等API接口，采用RESTful风格，确保接口的规范性与可扩展性；</w:t>
+      </w:r>
+    </w:p>
+    <w:p>
+      <w:pPr>
+        <w:spacing w:before="120" w:after="120" w:line="288" w:lineRule="auto"/>
+        <w:ind w:left="0"/>
+        <w:jc w:val="left"/>
+      </w:pPr>
+      <w:r>
+        <w:t>2.  异步任务调度：利用Python多线程机制实现重建任务的异步调度，将耗时的重建任务放入后台线程执行，避免阻塞前端HTTP请求，提升系统的并发处理能力；预留Celery+Redis扩展接口，在需要时可无缝升级为分布式任务队列，满足大规模并发需求。</w:t>
+      </w:r>
+    </w:p>
+    <w:p>
+      <w:pPr>
+        <w:spacing w:before="120" w:after="120" w:line="288" w:lineRule="auto"/>
+        <w:ind w:left="0"/>
+        <w:jc w:val="left"/>
+      </w:pPr>
+      <w:r>
+        <w:rPr>
+          <w:rFonts w:ascii="Arial" w:hAnsi="Arial" w:eastAsia="等线" w:cs="Arial"/>
+          <w:sz w:val="22"/>
+        </w:rPr>
+        <w:t>3.  数据存储：设计数据库（采用SQLite或MySQL），存储用户信息、上传的图像数据、重建任务信息、重建结果等，确保数据的安全性与可追溯性；</w:t>
+      </w:r>
+    </w:p>
+    <w:p>
+      <w:pPr>
+        <w:spacing w:before="120" w:after="120" w:line="288" w:lineRule="auto"/>
+        <w:ind w:left="0"/>
+        <w:jc w:val="left"/>
+      </w:pPr>
+      <w:r>
+        <w:rPr>
+          <w:rFonts w:ascii="Arial" w:hAnsi="Arial" w:eastAsia="等线" w:cs="Arial"/>
+          <w:sz w:val="22"/>
+        </w:rPr>
+        <w:t>4.  异常处理：添加接口异常处理、任务失败重试、权限验证等功能，提升系统的稳定性与安全性。</w:t>
       </w:r>
     </w:p>
     <w:p>
@@ -983,101 +1032,13 @@
         <w:jc w:val="left"/>
         <w:outlineLvl w:val="2"/>
       </w:pPr>
-      <w:bookmarkStart w:id="16" w:name="heading_16"/>
+      <w:bookmarkStart w:id="17" w:name="heading_17"/>
       <w:r>
         <w:rPr>
           <w:rFonts w:ascii="Arial" w:hAnsi="Arial" w:eastAsia="等线" w:cs="Arial"/>
           <w:b/>
           <w:sz w:val="30"/>
         </w:rPr>
-        <w:t>3.2.4 Flask后端API封装</w:t>
-      </w:r>
-      <w:bookmarkEnd w:id="16"/>
-    </w:p>
-    <w:p>
-      <w:pPr>
-        <w:spacing w:before="120" w:after="120" w:line="288" w:lineRule="auto"/>
-        <w:ind w:left="0"/>
-        <w:jc w:val="left"/>
-      </w:pPr>
-      <w:r>
-        <w:rPr>
-          <w:rFonts w:ascii="Arial" w:hAnsi="Arial" w:eastAsia="等线" w:cs="Arial"/>
-          <w:sz w:val="22"/>
-        </w:rPr>
-        <w:t>该模块负责将上述三个核心模块封装为API接口，实现前端与后端的交互，处理用户的请求，完成重建任务的调度与执行。具体实现内容包括：</w:t>
-      </w:r>
-    </w:p>
-    <w:p>
-      <w:pPr>
-        <w:spacing w:before="120" w:after="120" w:line="288" w:lineRule="auto"/>
-        <w:ind w:left="0"/>
-        <w:jc w:val="left"/>
-      </w:pPr>
-      <w:r>
-        <w:rPr>
-          <w:rFonts w:ascii="Arial" w:hAnsi="Arial" w:eastAsia="等线" w:cs="Arial"/>
-          <w:sz w:val="22"/>
-        </w:rPr>
-        <w:t>1.  API接口设计：设计图像上传、重建任务提交、进度查询、模型下载、任务取消等API接口，采用RESTful风格，确保接口的规范性与可扩展性；</w:t>
-      </w:r>
-    </w:p>
-    <w:p>
-      <w:pPr>
-        <w:spacing w:before="120" w:after="120" w:line="288" w:lineRule="auto"/>
-        <w:ind w:left="0"/>
-        <w:jc w:val="left"/>
-      </w:pPr>
-      <w:r>
-        <w:rPr>
-          <w:rFonts w:ascii="Arial" w:hAnsi="Arial" w:eastAsia="等线" w:cs="Arial"/>
-          <w:sz w:val="22"/>
-        </w:rPr>
-        <w:t>2.  异步任务调度：利用Celery框架实现重建任务的异步调度，将耗时的重建任务放入任务队列，避免阻塞前端请求，提升系统的并发处理能力；引入Redis作为消息中间件，负责任务的存储与调度，确保任务的可靠执行；</w:t>
-      </w:r>
-    </w:p>
-    <w:p>
-      <w:pPr>
-        <w:spacing w:before="120" w:after="120" w:line="288" w:lineRule="auto"/>
-        <w:ind w:left="0"/>
-        <w:jc w:val="left"/>
-      </w:pPr>
-      <w:r>
-        <w:rPr>
-          <w:rFonts w:ascii="Arial" w:hAnsi="Arial" w:eastAsia="等线" w:cs="Arial"/>
-          <w:sz w:val="22"/>
-        </w:rPr>
-        <w:t>3.  数据存储：设计数据库（采用SQLite或MySQL），存储用户信息、上传的图像数据、重建任务信息、重建结果等，确保数据的安全性与可追溯性；</w:t>
-      </w:r>
-    </w:p>
-    <w:p>
-      <w:pPr>
-        <w:spacing w:before="120" w:after="120" w:line="288" w:lineRule="auto"/>
-        <w:ind w:left="0"/>
-        <w:jc w:val="left"/>
-      </w:pPr>
-      <w:r>
-        <w:rPr>
-          <w:rFonts w:ascii="Arial" w:hAnsi="Arial" w:eastAsia="等线" w:cs="Arial"/>
-          <w:sz w:val="22"/>
-        </w:rPr>
-        <w:t>4.  异常处理：添加接口异常处理、任务失败重试、权限验证等功能，提升系统的稳定性与安全性。</w:t>
-      </w:r>
-    </w:p>
-    <w:p>
-      <w:pPr>
-        <w:spacing w:before="300" w:after="120" w:line="288" w:lineRule="auto"/>
-        <w:ind w:left="0"/>
-        <w:jc w:val="left"/>
-        <w:outlineLvl w:val="2"/>
-      </w:pPr>
-      <w:bookmarkStart w:id="17" w:name="heading_17"/>
-      <w:r>
-        <w:rPr>
-          <w:rFonts w:ascii="Arial" w:hAnsi="Arial" w:eastAsia="等线" w:cs="Arial"/>
-          <w:b/>
-          <w:sz w:val="30"/>
-        </w:rPr>
         <w:t>3.2.5 React + Three.js前端展示界面</w:t>
       </w:r>
       <w:bookmarkEnd w:id="17"/>
@@ -1159,11 +1120,7 @@
         <w:jc w:val="left"/>
       </w:pPr>
       <w:r>
-        <w:rPr>
-          <w:rFonts w:ascii="Arial" w:hAnsi="Arial" w:eastAsia="等线" w:cs="Arial"/>
-          <w:sz w:val="22"/>
-        </w:rPr>
-        <w:t>5.  模型下载：支持将重建后的稠密点云或三维网格模型导出为多种格式（如PLY、OBJ、GLTF等），满足不同用户的使用需求；</w:t>
+        <w:t>5.  模型下载：支持将重建后的稠密点云或三维网格模型导出为PLY、OBJ等标准格式，满足不同用户的使用需求。</w:t>
       </w:r>
     </w:p>
     <w:p>
@@ -1486,10 +1443,6 @@
               <w:jc w:val="left"/>
             </w:pPr>
             <w:r>
-              <w:rPr>
-                <w:rFonts w:ascii="Arial" w:hAnsi="Arial" w:eastAsia="等线" w:cs="Arial"/>
-                <w:sz w:val="22"/>
-              </w:rPr>
               <w:t>算法层</w:t>
             </w:r>
           </w:p>
@@ -1511,11 +1464,7 @@
               <w:jc w:val="left"/>
             </w:pPr>
             <w:r>
-              <w:rPr>
-                <w:rFonts w:ascii="Arial" w:hAnsi="Arial" w:eastAsia="等线" w:cs="Arial"/>
-                <w:sz w:val="22"/>
-              </w:rPr>
-              <w:t>PyTorch、MVSNet、CasMVSNet</w:t>
+              <w:t>PyTorch、CasMVSNet、PatchMatchNet</w:t>
             </w:r>
           </w:p>
         </w:tc>
@@ -1536,11 +1485,7 @@
               <w:jc w:val="left"/>
             </w:pPr>
             <w:r>
-              <w:rPr>
-                <w:rFonts w:ascii="Arial" w:hAnsi="Arial" w:eastAsia="等线" w:cs="Arial"/>
-                <w:sz w:val="22"/>
-              </w:rPr>
-              <w:t>深度神经网络搭建、深度估计推理、模型优化</w:t>
+              <w:t>深度神经网络搭建、级联深度估计推理、模型管理</w:t>
             </w:r>
           </w:p>
         </w:tc>
@@ -1583,7 +1528,7 @@
                 <w:rFonts w:ascii="Arial" w:hAnsi="Arial" w:eastAsia="等线" w:cs="Arial"/>
                 <w:sz w:val="22"/>
               </w:rPr>
-              <w:t>算法层</w:t>
+              <w:t>后端层</w:t>
             </w:r>
           </w:p>
         </w:tc>
@@ -1608,7 +1553,7 @@
                 <w:rFonts w:ascii="Arial" w:hAnsi="Arial" w:eastAsia="等线" w:cs="Arial"/>
                 <w:sz w:val="22"/>
               </w:rPr>
-              <w:t>TensorRT</w:t>
+              <w:t>Flask</w:t>
             </w:r>
           </w:p>
         </w:tc>
@@ -1633,7 +1578,7 @@
                 <w:rFonts w:ascii="Arial" w:hAnsi="Arial" w:eastAsia="等线" w:cs="Arial"/>
                 <w:sz w:val="22"/>
               </w:rPr>
-              <w:t>深度学习模型推理加速</w:t>
+              <w:t>Web后端开发、API接口封装</w:t>
             </w:r>
           </w:p>
         </w:tc>
@@ -1701,7 +1646,7 @@
                 <w:rFonts w:ascii="Arial" w:hAnsi="Arial" w:eastAsia="等线" w:cs="Arial"/>
                 <w:sz w:val="22"/>
               </w:rPr>
-              <w:t>Flask</w:t>
+              <w:t>Celery、Redis</w:t>
             </w:r>
           </w:p>
         </w:tc>
@@ -1726,7 +1671,7 @@
                 <w:rFonts w:ascii="Arial" w:hAnsi="Arial" w:eastAsia="等线" w:cs="Arial"/>
                 <w:sz w:val="22"/>
               </w:rPr>
-              <w:t>Web后端开发、API接口封装</w:t>
+              <w:t>异步任务调度、消息中间件</w:t>
             </w:r>
           </w:p>
         </w:tc>
@@ -1790,11 +1735,7 @@
               <w:jc w:val="left"/>
             </w:pPr>
             <w:r>
-              <w:rPr>
-                <w:rFonts w:ascii="Arial" w:hAnsi="Arial" w:eastAsia="等线" w:cs="Arial"/>
-                <w:sz w:val="22"/>
-              </w:rPr>
-              <w:t>Celery、Redis</w:t>
+              <w:t>Threading（预留Celery+Redis扩展）</w:t>
             </w:r>
           </w:p>
         </w:tc>
@@ -1815,11 +1756,7 @@
               <w:jc w:val="left"/>
             </w:pPr>
             <w:r>
-              <w:rPr>
-                <w:rFonts w:ascii="Arial" w:hAnsi="Arial" w:eastAsia="等线" w:cs="Arial"/>
-                <w:sz w:val="22"/>
-              </w:rPr>
-              <w:t>异步任务调度、消息中间件</w:t>
+              <w:t>异步任务调度、后台线程管理</w:t>
             </w:r>
           </w:p>
         </w:tc>
@@ -1862,7 +1799,7 @@
                 <w:rFonts w:ascii="Arial" w:hAnsi="Arial" w:eastAsia="等线" w:cs="Arial"/>
                 <w:sz w:val="22"/>
               </w:rPr>
-              <w:t>后端层</w:t>
+              <w:t>前端层</w:t>
             </w:r>
           </w:p>
         </w:tc>
@@ -1887,7 +1824,7 @@
                 <w:rFonts w:ascii="Arial" w:hAnsi="Arial" w:eastAsia="等线" w:cs="Arial"/>
                 <w:sz w:val="22"/>
               </w:rPr>
-              <w:t>SQLite/MySQL</w:t>
+              <w:t>React</w:t>
             </w:r>
           </w:p>
         </w:tc>
@@ -1912,7 +1849,7 @@
                 <w:rFonts w:ascii="Arial" w:hAnsi="Arial" w:eastAsia="等线" w:cs="Arial"/>
                 <w:sz w:val="22"/>
               </w:rPr>
-              <w:t>数据存储（用户信息、任务信息、重建结果）</w:t>
+              <w:t>前端界面开发、组件化管理</w:t>
             </w:r>
           </w:p>
         </w:tc>
@@ -1980,7 +1917,7 @@
                 <w:rFonts w:ascii="Arial" w:hAnsi="Arial" w:eastAsia="等线" w:cs="Arial"/>
                 <w:sz w:val="22"/>
               </w:rPr>
-              <w:t>React</w:t>
+              <w:t>Three.js、react-three-fiber</w:t>
             </w:r>
           </w:p>
         </w:tc>
@@ -2005,7 +1942,7 @@
                 <w:rFonts w:ascii="Arial" w:hAnsi="Arial" w:eastAsia="等线" w:cs="Arial"/>
                 <w:sz w:val="22"/>
               </w:rPr>
-              <w:t>前端界面开发、组件化管理</w:t>
+              <w:t>三维模型可视化、交互操作</w:t>
             </w:r>
           </w:p>
         </w:tc>
@@ -2048,99 +1985,6 @@
                 <w:rFonts w:ascii="Arial" w:hAnsi="Arial" w:eastAsia="等线" w:cs="Arial"/>
                 <w:sz w:val="22"/>
               </w:rPr>
-              <w:t>前端层</w:t>
-            </w:r>
-          </w:p>
-        </w:tc>
-        <w:tc>
-          <w:tcPr>
-            <w:tcW w:w="2760" w:type="dxa"/>
-            <w:tcMar>
-              <w:top w:w="60" w:type="dxa"/>
-              <w:left w:w="120" w:type="dxa"/>
-              <w:bottom w:w="30" w:type="dxa"/>
-              <w:right w:w="120" w:type="dxa"/>
-            </w:tcMar>
-          </w:tcPr>
-          <w:p>
-            <w:pPr>
-              <w:spacing w:before="120" w:after="120" w:line="288" w:lineRule="auto"/>
-              <w:ind w:left="0"/>
-              <w:jc w:val="left"/>
-            </w:pPr>
-            <w:r>
-              <w:rPr>
-                <w:rFonts w:ascii="Arial" w:hAnsi="Arial" w:eastAsia="等线" w:cs="Arial"/>
-                <w:sz w:val="22"/>
-              </w:rPr>
-              <w:t>Three.js、react-three-fiber</w:t>
-            </w:r>
-          </w:p>
-        </w:tc>
-        <w:tc>
-          <w:tcPr>
-            <w:tcW w:w="2760" w:type="dxa"/>
-            <w:tcMar>
-              <w:top w:w="60" w:type="dxa"/>
-              <w:left w:w="120" w:type="dxa"/>
-              <w:bottom w:w="30" w:type="dxa"/>
-              <w:right w:w="120" w:type="dxa"/>
-            </w:tcMar>
-          </w:tcPr>
-          <w:p>
-            <w:pPr>
-              <w:spacing w:before="120" w:after="120" w:line="288" w:lineRule="auto"/>
-              <w:ind w:left="0"/>
-              <w:jc w:val="left"/>
-            </w:pPr>
-            <w:r>
-              <w:rPr>
-                <w:rFonts w:ascii="Arial" w:hAnsi="Arial" w:eastAsia="等线" w:cs="Arial"/>
-                <w:sz w:val="22"/>
-              </w:rPr>
-              <w:t>三维模型可视化、交互操作</w:t>
-            </w:r>
-          </w:p>
-        </w:tc>
-      </w:tr>
-      <w:tr>
-        <w:tblPrEx>
-          <w:tblBorders>
-            <w:top w:val="single" w:color="DEE0E3" w:sz="0" w:space="0"/>
-            <w:left w:val="single" w:color="DEE0E3" w:sz="0" w:space="0"/>
-            <w:bottom w:val="single" w:color="DEE0E3" w:sz="0" w:space="0"/>
-            <w:right w:val="single" w:color="DEE0E3" w:sz="0" w:space="0"/>
-            <w:insideH w:val="single" w:color="DEE0E3" w:sz="0" w:space="0"/>
-            <w:insideV w:val="single" w:color="DEE0E3" w:sz="0" w:space="0"/>
-          </w:tblBorders>
-          <w:tblCellMar>
-            <w:top w:w="0" w:type="dxa"/>
-            <w:left w:w="10" w:type="dxa"/>
-            <w:bottom w:w="0" w:type="dxa"/>
-            <w:right w:w="10" w:type="dxa"/>
-          </w:tblCellMar>
-        </w:tblPrEx>
-        <w:tc>
-          <w:tcPr>
-            <w:tcW w:w="2760" w:type="dxa"/>
-            <w:tcMar>
-              <w:top w:w="60" w:type="dxa"/>
-              <w:left w:w="120" w:type="dxa"/>
-              <w:bottom w:w="30" w:type="dxa"/>
-              <w:right w:w="120" w:type="dxa"/>
-            </w:tcMar>
-          </w:tcPr>
-          <w:p>
-            <w:pPr>
-              <w:spacing w:before="120" w:after="120" w:line="288" w:lineRule="auto"/>
-              <w:ind w:left="0"/>
-              <w:jc w:val="left"/>
-            </w:pPr>
-            <w:r>
-              <w:rPr>
-                <w:rFonts w:ascii="Arial" w:hAnsi="Arial" w:eastAsia="等线" w:cs="Arial"/>
-                <w:sz w:val="22"/>
-              </w:rPr>
               <w:t>工具类</w:t>
             </w:r>
           </w:p>
@@ -2309,25 +2153,17 @@
         <w:jc w:val="left"/>
       </w:pPr>
       <w:r>
-        <w:rPr>
-          <w:rFonts w:ascii="Arial" w:hAnsi="Arial" w:eastAsia="等线" w:cs="Arial"/>
-          <w:sz w:val="22"/>
-        </w:rPr>
-        <w:t>5.  深度推理：转换后的输入数据传入PyTorch搭建的MVSNet模型，进行深度估计推理，生成稠密深度图，通过TensorRT优化推理速度，并对深度图进行去噪、空洞填充等优化；</w:t>
-      </w:r>
-    </w:p>
-    <w:p>
-      <w:pPr>
-        <w:spacing w:before="120" w:after="120" w:line="288" w:lineRule="auto"/>
-        <w:ind w:left="0"/>
-        <w:jc w:val="left"/>
-      </w:pPr>
-      <w:r>
-        <w:rPr>
-          <w:rFonts w:ascii="Arial" w:hAnsi="Arial" w:eastAsia="等线" w:cs="Arial"/>
-          <w:sz w:val="22"/>
-        </w:rPr>
-        <w:t>6.  深度融合：将优化后的稠密深度图传入COLMAP深度融合模块，与稀疏点云进行融合，生成高精度的稠密点云，再对稠密点云进行去噪、滤波、简化处理；</w:t>
+        <w:t>5.  深度推理：转换后的输入数据传入PyTorch搭建的CasMVSNet模型，通过三阶段级联深度估计生成稠密深度图；支持GPU加速推理与CPU自动回退，并对深度图进行置信度评估与多视图一致性验证。</w:t>
+      </w:r>
+    </w:p>
+    <w:p>
+      <w:pPr>
+        <w:spacing w:before="120" w:after="120" w:line="288" w:lineRule="auto"/>
+        <w:ind w:left="0"/>
+        <w:jc w:val="left"/>
+      </w:pPr>
+      <w:r>
+        <w:t>6.  深度融合：将各视角的稠密深度图传入自研DenseFusion融合引擎，通过多视角几何一致性过滤与重投影验证，将多视角深度图融合为稠密点云；再对点云进行体素降采样与异常值过滤处理。若选择COLMAP PatchMatch模式，则直接调用COLMAP的立体匹配与融合管道生成稠密点云。</w:t>
       </w:r>
     </w:p>
     <w:p>
@@ -2429,25 +2265,17 @@
         <w:jc w:val="left"/>
       </w:pPr>
       <w:r>
-        <w:rPr>
-          <w:rFonts w:ascii="Arial" w:hAnsi="Arial" w:eastAsia="等线" w:cs="Arial"/>
-          <w:sz w:val="22"/>
-        </w:rPr>
-        <w:t>3.  异步任务调度技术：利用Celery+Redis实现重建任务的异步调度，将耗时的重建任务（如深度推理、深度融合）放入任务队列，实现多任务并发处理，提升系统的响应速度与并发能力；</w:t>
-      </w:r>
-    </w:p>
-    <w:p>
-      <w:pPr>
-        <w:spacing w:before="120" w:after="120" w:line="288" w:lineRule="auto"/>
-        <w:ind w:left="0"/>
-        <w:jc w:val="left"/>
-      </w:pPr>
-      <w:r>
-        <w:rPr>
-          <w:rFonts w:ascii="Arial" w:hAnsi="Arial" w:eastAsia="等线" w:cs="Arial"/>
-          <w:sz w:val="22"/>
-        </w:rPr>
-        <w:t>4.  GPU推理加速技术：通过PyTorch的GPU加速功能与TensorRT模型优化，提升深度学习MVS模型的推理速度，降低计算成本，确保系统在普通GPU上能够高效运行；</w:t>
+        <w:t>3.  异步任务调度技术：利用Python多线程机制实现重建任务的异步调度，将耗时的重建任务（如深度推理、深度融合）放入后台线程执行，前端通过轮询API实时获取进度信息；架构预留Celery+Redis接口，支持未来扩展为分布式任务队列，实现多任务并发处理与横向扩展。</w:t>
+      </w:r>
+    </w:p>
+    <w:p>
+      <w:pPr>
+        <w:spacing w:before="120" w:after="120" w:line="288" w:lineRule="auto"/>
+        <w:ind w:left="0"/>
+        <w:jc w:val="left"/>
+      </w:pPr>
+      <w:r>
+        <w:t>4.  GPU推理加速技术：通过PyTorch的GPU加速功能，充分利用CUDA核心进行深度学习MVS模型的并行推理；采用三阶段级联CasMVSNet架构，从低分辨率到高分辨率逐阶段细化深度估计，在保证精度的前提下显著降低计算复杂度；支持CPU自动回退模式，在无GPU环境中仍可完成推理（但速度较慢），提升系统的硬件兼容性。</w:t>
       </w:r>
     </w:p>
     <w:p>
@@ -2489,11 +2317,7 @@
         <w:jc w:val="left"/>
       </w:pPr>
       <w:r>
-        <w:rPr>
-          <w:rFonts w:ascii="Arial" w:hAnsi="Arial" w:eastAsia="等线" w:cs="Arial"/>
-          <w:sz w:val="22"/>
-        </w:rPr>
-        <w:t>1.  难点一：COLMAP与深度学习MVS模型的格式兼容问题。COLMAP输出的相机参数、稀疏点云格式与深度学习模型的输入格式存在差异，直接传入会导致模型推理失败。解决方案：设计专门的格式转换模块，统一坐标系与数据类型，将COLMAP输出的相机外参转换为模型所需的4×4变换矩阵，将稀疏点云转换为模型可识别的点云格式，同时对图像进行归一化处理，确保数据格式一致；参考主流模型格式的兼容性特点，优先选择OBJ、GLTF等通用格式作为中间转换格式，减少格式丢失。</w:t>
+        <w:t>1.  难点一：COLMAP与深度学习MVS模型的格式兼容问题。COLMAP输出的相机参数、稀疏点云格式与深度学习模型的输入格式存在差异，其中关键点是相机外参的坐标系转换（COLMAP输出World-to-Camera，而MVS网络需要Camera-to-World）、内参缩放适配、以及深度范围估计。解决方案：设计专门的格式转换模块（FormatConverter），统一坐标系与数据类型，正确处理外参矩阵的逆变换，对图像进行ImageNet标准化归一化处理，从稀疏点云自动估计场景深度范围，确保数据格式一致且几何精度不丢失。</w:t>
       </w:r>
     </w:p>
     <w:p>
@@ -2517,11 +2341,7 @@
         <w:jc w:val="left"/>
       </w:pPr>
       <w:r>
-        <w:rPr>
-          <w:rFonts w:ascii="Arial" w:hAnsi="Arial" w:eastAsia="等线" w:cs="Arial"/>
-          <w:sz w:val="22"/>
-        </w:rPr>
-        <w:t>3.  难点三：GPU推理加速与硬件适配。深度学习MVS模型的推理过程消耗大量GPU资源，普通GPU的推理速度较慢，且不同GPU型号的适配性较差。解决方案：采用TensorRT对模型进行优化，通过量化、剪枝等操作，降低模型的计算复杂度，提升推理速度；利用PyTorch的GPU设备适配功能，自动检测当前硬件的GPU型号，选择合适的推理参数，确保模型在不同GPU（GTX 1060及以上）上均能正常运行；对深度图进行分块处理，减少显存占用。</w:t>
+        <w:t>3.  难点三：GPU推理加速与硬件适配。深度学习MVS模型的推理过程消耗大量GPU资源，且不同GPU型号的显存和算力差异较大。解决方案：采用CasMVSNet三阶段级联架构，通过由粗到细的深度估计策略，在低分辨率阶段快速估计大范围深度，在高分辨率阶段精细优化，有效降低整体计算量；利用PyTorch的GPU设备适配功能，自动检测CUDA可用性，无GPU时自动回退CPU模式；对大尺寸图像自动缩放到2000px以内，减少显存占用；支持PatchMatchNet作为轻量级备选模型，进一步降低硬件需求。</w:t>
       </w:r>
     </w:p>
     <w:p>
@@ -2960,11 +2780,7 @@
               <w:jc w:val="left"/>
             </w:pPr>
             <w:r>
-              <w:rPr>
-                <w:rFonts w:ascii="Arial" w:hAnsi="Arial" w:eastAsia="等线" w:cs="Arial"/>
-                <w:sz w:val="22"/>
-              </w:rPr>
-              <w:t>1. 开发COLMAP相机位姿估计模块，完成特征提取、位姿估计与稀疏点云构建；2. 搭建MVSNet模型，完成预训练模型加载与深度推理；3. 开发格式转换模块与深度融合模块；4. 联调三个核心算法模块，测试重建效果，优化算法参数。</w:t>
+              <w:t>1. 开发COLMAP相机位姿估计模块，完成特征提取、位姿估计与稀疏点云构建；2. 搭建CasMVSNet三阶段级联深度估计网络，加载预训练权重并完成模型适配；3. 开发自研DenseFusion深度图融合引擎，实现多视角几何一致性过滤；4. 实现COLMAP PatchMatch稠密重建路径作为备选方案；5. 开发FormatConverter格式转换模块，完成COLMAP→MVS的数据流转；6. 联调各子模块，验证端到端重建管道的正确性。</w:t>
             </w:r>
           </w:p>
         </w:tc>
@@ -3078,11 +2894,7 @@
               <w:jc w:val="left"/>
             </w:pPr>
             <w:r>
-              <w:rPr>
-                <w:rFonts w:ascii="Arial" w:hAnsi="Arial" w:eastAsia="等线" w:cs="Arial"/>
-                <w:sz w:val="22"/>
-              </w:rPr>
-              <w:t>1. 设计并开发RESTful API接口；2. 利用Celery+Redis实现异步任务调度；3. 开发数据存储模块，设计数据库表结构，实现数据的增删改查；4. 添加异常处理、权限验证功能；5. 测试后端接口的稳定性与性能。</w:t>
+              <w:t>1. 设计并开发RESTful API接口（任务创建、进度查询、结果下载等）；2. 利用Python Threading实现异步任务调度，预留Celery+Redis扩展接口；3. 设计SQLite数据库模型，存储任务信息和重建结果；4. 实现任务进度回调与前端实时推送机制。</w:t>
             </w:r>
           </w:p>
         </w:tc>
@@ -3196,11 +3008,7 @@
               <w:jc w:val="left"/>
             </w:pPr>
             <w:r>
-              <w:rPr>
-                <w:rFonts w:ascii="Arial" w:hAnsi="Arial" w:eastAsia="等线" w:cs="Arial"/>
-                <w:sz w:val="22"/>
-              </w:rPr>
-              <w:t>1. 利用React构建前端界面，实现图像上传、进度展示、模型可视化、下载等功能；2. 利用Three.js实现三维模型的可视化与交互操作；3. 实现前端与后端的接口对接，测试交互功能；4. 优化界面布局，实现响应式设计，适配不同设备。</w:t>
+              <w:t>1. 利用React构建前端界面，实现图像上传、进度展示、模型可视化、下载等功能；2. 利用Three.js+react-three-fiber实现3D点云实时渲染与交互操作；3. 实现PLY/OBJ等格式的模型下载功能；4. 完成前后端联调与接口对接。</w:t>
             </w:r>
           </w:p>
         </w:tc>
@@ -3314,11 +3122,7 @@
               <w:jc w:val="left"/>
             </w:pPr>
             <w:r>
-              <w:rPr>
-                <w:rFonts w:ascii="Arial" w:hAnsi="Arial" w:eastAsia="等线" w:cs="Arial"/>
-                <w:sz w:val="22"/>
-              </w:rPr>
-              <w:t>1. 进行功能测试，验证各模块的正确性；2. 进行性能测试，优化重建速度与前端渲染效率；3. 测试弱纹理、高光、重复纹理场景的重建效果，优化算法；4. 修复系统中的bug，提升系统稳定性；5. 优化用户体验，完善界面交互逻辑。</w:t>
+              <w:t>1. 进行功能测试，验证各模块的正确性；2. 使用合成场景（高纹理球体）验证MVS网络精度与重叠率；3. 使用真实照片测试COLMAP PatchMatch路径的稳定性；4. 测试CPU回退模式下的兼容性。</w:t>
             </w:r>
           </w:p>
         </w:tc>
@@ -3677,11 +3481,7 @@
               <w:jc w:val="left"/>
             </w:pPr>
             <w:r>
-              <w:rPr>
-                <w:rFonts w:ascii="Arial" w:hAnsi="Arial" w:eastAsia="等线" w:cs="Arial"/>
-                <w:sz w:val="22"/>
-              </w:rPr>
-              <w:t>1. 搭建COLMAP相机位姿估计模块，完成特征提取、位姿估计与稀疏点云构建；2. 搭建并优化MVSNet深度学习模型，实现深度估计推理；3. 开发格式转换模块与深度融合模块；4. 负责算法参数优化、GPU推理加速；5. 参与Pipeline联调与系统测试，解决算法相关bug。</w:t>
+              <w:t>1. 搭建COLMAP相机位姿估计模块，完成特征提取、位姿估计与稀疏点云构建；2. 搭建并优化CasMVSNet三阶段级联深度估计网络，加载预训练权重；3. 实现自研DenseFusion深度图融合引擎与FormatConverter格式转换模块；4. 集成PatchMatchNet备选模型与COLMAP PatchMatch双路径管道；5. 模型测试与性能评估。</w:t>
             </w:r>
           </w:p>
         </w:tc>
@@ -3770,11 +3570,7 @@
               <w:jc w:val="left"/>
             </w:pPr>
             <w:r>
-              <w:rPr>
-                <w:rFonts w:ascii="Arial" w:hAnsi="Arial" w:eastAsia="等线" w:cs="Arial"/>
-                <w:sz w:val="22"/>
-              </w:rPr>
-              <w:t>1. 搭建Flask后端框架，开发API接口与异步任务调度模块；2. 设计并实现数据库与数据存储功能；3. 利用React+Three.js开发前端界面与三维可视化功能；4. 实现前后端接口对接，优化交互体验；5. 负责系统测试、bug修复与部署；6. 撰写项目文档，准备答辩资料。</w:t>
+              <w:t>1. 搭建Flask后端框架，开发RESTful API接口与Threading异步任务调度模块；2. 设计并实现SQLite数据库与数据存储功能；3. 搭建React前端界面，实现Three.js 3D点云可视化与交互功能；4. 实现图像上传、进度展示、模型下载等前端功能模块；5. 前后端联调、系统测试与部署。</w:t>
             </w:r>
           </w:p>
         </w:tc>

</xml_diff>